<commit_message>
Add Relatorios.pdf e .docx
</commit_message>
<xml_diff>
--- a/evidencias/06-relatorio/Relatorio.docx
+++ b/evidencias/06-relatorio/Relatorio.docx
@@ -4550,15 +4550,19 @@
         </w:rPr>
         <w:br w:type="textWrapping"/>
       </w:r>
-      <w:r>
-        <w:rPr>
-          <w:rFonts w:ascii="Arial" w:cs="Arial" w:eastAsia="Arial" w:hAnsi="Arial"/>
-          <w:sz w:val="24"/>
-          <w:szCs w:val="24"/>
-          <w:rtl w:val="0"/>
-        </w:rPr>
-        <w:t xml:space="preserve">[INSERIR LINK DA PASTA DE EVIDÊNCIAS]</w:t>
-      </w:r>
+      <w:hyperlink r:id="rId11">
+        <w:r>
+          <w:rPr>
+            <w:rFonts w:ascii="Arial" w:cs="Arial" w:eastAsia="Arial" w:hAnsi="Arial"/>
+            <w:color w:val="1155cc"/>
+            <w:sz w:val="24"/>
+            <w:szCs w:val="24"/>
+            <w:u w:val="single"/>
+            <w:rtl w:val="0"/>
+          </w:rPr>
+          <w:t xml:space="preserve">https://github.com/ivanfborges/sbst-vs-llm/tree/main/evidencias</w:t>
+        </w:r>
+      </w:hyperlink>
       <w:r>
         <w:rPr>
           <w:rtl w:val="0"/>
@@ -4566,7 +4570,7 @@
       </w:r>
     </w:p>
     <w:sectPr>
-      <w:footerReference r:id="rId11" w:type="default"/>
+      <w:footerReference r:id="rId12" w:type="default"/>
       <w:pgSz w:h="15840" w:w="12240" w:orient="portrait"/>
       <w:pgMar w:bottom="1440" w:top="1440" w:left="1800" w:right="1800" w:header="720" w:footer="720"/>
       <w:pgNumType w:start="1"/>

</xml_diff>